<commit_message>
Parzialmente implementata generazione template e PDF lato API
Corretti alcuni parametri del tagliando
Aggiunte nuove funzioni helper
Fix bug con tipo delle transazioni di drizzle-orm
</commit_message>
<xml_diff>
--- a/to-backend/docx_examples/default_templates/default_autorizzazione.docx
+++ b/to-backend/docx_examples/default_templates/default_autorizzazione.docx
@@ -8,476 +8,394 @@
           <w:rFonts w:ascii="Arial" w:hAnsi="Arial" w:cs="Arial"/>
         </w:rPr>
       </w:pPr>
-      <w:proofErr w:type="spellStart"/>
-      <w:r>
-        <w:rPr>
-          <w:rFonts w:ascii="Arial" w:hAnsi="Arial" w:cs="Arial"/>
-        </w:rPr>
-        <w:t>numeroTalignadoStr</w:t>
-      </w:r>
-      <w:proofErr w:type="spellEnd"/>
-      <w:r>
-        <w:rPr>
-          <w:rFonts w:ascii="Arial" w:hAnsi="Arial" w:cs="Arial"/>
-        </w:rPr>
-        <w:t>: {#numeroTalignadoStr#}</w:t>
-      </w:r>
-    </w:p>
-    <w:p>
-      <w:pPr>
-        <w:rPr>
-          <w:rFonts w:ascii="Arial" w:hAnsi="Arial" w:cs="Arial"/>
-        </w:rPr>
-      </w:pPr>
-      <w:proofErr w:type="spellStart"/>
-      <w:r>
-        <w:rPr>
-          <w:rFonts w:ascii="Arial" w:hAnsi="Arial" w:cs="Arial"/>
-        </w:rPr>
-        <w:t>descrizionePermessoStr</w:t>
-      </w:r>
-      <w:proofErr w:type="spellEnd"/>
-      <w:r>
-        <w:rPr>
-          <w:rFonts w:ascii="Arial" w:hAnsi="Arial" w:cs="Arial"/>
-        </w:rPr>
-        <w:t>: {#descrizionePermessoStr#}</w:t>
-      </w:r>
-    </w:p>
-    <w:p>
-      <w:pPr>
-        <w:rPr>
-          <w:rFonts w:ascii="Arial" w:hAnsi="Arial" w:cs="Arial"/>
-        </w:rPr>
-      </w:pPr>
-      <w:proofErr w:type="spellStart"/>
-      <w:r>
-        <w:rPr>
-          <w:rFonts w:ascii="Arial" w:hAnsi="Arial" w:cs="Arial"/>
-        </w:rPr>
-        <w:t>tipologiaDomanda</w:t>
-      </w:r>
-      <w:proofErr w:type="spellEnd"/>
-      <w:r>
-        <w:rPr>
-          <w:rFonts w:ascii="Arial" w:hAnsi="Arial" w:cs="Arial"/>
-        </w:rPr>
-        <w:t>: {#tipologiaDomanda#}</w:t>
-      </w:r>
-    </w:p>
-    <w:p>
-      <w:pPr>
-        <w:rPr>
-          <w:rFonts w:ascii="Arial" w:hAnsi="Arial" w:cs="Arial"/>
-        </w:rPr>
-      </w:pPr>
-      <w:proofErr w:type="spellStart"/>
-      <w:r>
-        <w:rPr>
-          <w:rFonts w:ascii="Arial" w:hAnsi="Arial" w:cs="Arial"/>
-        </w:rPr>
-        <w:t>dataProtocolloStr</w:t>
-      </w:r>
-      <w:proofErr w:type="spellEnd"/>
-      <w:r>
-        <w:rPr>
-          <w:rFonts w:ascii="Arial" w:hAnsi="Arial" w:cs="Arial"/>
-        </w:rPr>
-        <w:t>: {#dataProtocolloStr#}</w:t>
-      </w:r>
-    </w:p>
-    <w:p>
-      <w:pPr>
-        <w:rPr>
-          <w:rFonts w:ascii="Arial" w:hAnsi="Arial" w:cs="Arial"/>
-        </w:rPr>
-      </w:pPr>
-      <w:proofErr w:type="spellStart"/>
-      <w:r>
-        <w:rPr>
-          <w:rFonts w:ascii="Arial" w:hAnsi="Arial" w:cs="Arial"/>
-        </w:rPr>
-        <w:t>numeroProtocolloStr</w:t>
-      </w:r>
-      <w:proofErr w:type="spellEnd"/>
-      <w:r>
-        <w:rPr>
-          <w:rFonts w:ascii="Arial" w:hAnsi="Arial" w:cs="Arial"/>
-        </w:rPr>
-        <w:t>: {#numeroProtocolloStr#}</w:t>
-      </w:r>
-    </w:p>
-    <w:p>
-      <w:pPr>
-        <w:rPr>
-          <w:rFonts w:ascii="Arial" w:hAnsi="Arial" w:cs="Arial"/>
-        </w:rPr>
-      </w:pPr>
-      <w:proofErr w:type="spellStart"/>
-      <w:r>
-        <w:rPr>
-          <w:rFonts w:ascii="Arial" w:hAnsi="Arial" w:cs="Arial"/>
-        </w:rPr>
-        <w:t>dataCopmletamentoStr</w:t>
-      </w:r>
-      <w:proofErr w:type="spellEnd"/>
-      <w:r>
-        <w:rPr>
-          <w:rFonts w:ascii="Arial" w:hAnsi="Arial" w:cs="Arial"/>
-        </w:rPr>
-        <w:t>: {#dataCopmletamentoStr#}</w:t>
-      </w:r>
-    </w:p>
-    <w:p>
-      <w:pPr>
-        <w:rPr>
-          <w:rFonts w:ascii="Arial" w:hAnsi="Arial" w:cs="Arial"/>
-        </w:rPr>
-      </w:pPr>
-      <w:proofErr w:type="spellStart"/>
-      <w:r>
-        <w:rPr>
-          <w:rFonts w:ascii="Arial" w:hAnsi="Arial" w:cs="Arial"/>
-        </w:rPr>
-        <w:t>dataInizioValiditaStr</w:t>
-      </w:r>
-      <w:proofErr w:type="spellEnd"/>
-      <w:r>
-        <w:rPr>
-          <w:rFonts w:ascii="Arial" w:hAnsi="Arial" w:cs="Arial"/>
-        </w:rPr>
-        <w:t>: {#dataInizioValiditaStr#}</w:t>
-      </w:r>
-    </w:p>
-    <w:p>
-      <w:pPr>
-        <w:rPr>
-          <w:rFonts w:ascii="Arial" w:hAnsi="Arial" w:cs="Arial"/>
-        </w:rPr>
-      </w:pPr>
-      <w:proofErr w:type="spellStart"/>
-      <w:r>
-        <w:rPr>
-          <w:rFonts w:ascii="Arial" w:hAnsi="Arial" w:cs="Arial"/>
-        </w:rPr>
-        <w:t>dataFineValiditaStr</w:t>
-      </w:r>
-      <w:proofErr w:type="spellEnd"/>
-      <w:r>
-        <w:rPr>
-          <w:rFonts w:ascii="Arial" w:hAnsi="Arial" w:cs="Arial"/>
-        </w:rPr>
-        <w:t>: {#dataFineValiditaStr#}</w:t>
-      </w:r>
-    </w:p>
-    <w:p>
-      <w:pPr>
-        <w:rPr>
-          <w:rFonts w:ascii="Arial" w:hAnsi="Arial" w:cs="Arial"/>
-        </w:rPr>
-      </w:pPr>
-      <w:proofErr w:type="spellStart"/>
-      <w:r>
-        <w:rPr>
-          <w:rFonts w:ascii="Arial" w:hAnsi="Arial" w:cs="Arial"/>
-        </w:rPr>
-        <w:t>cognomeIstruttoreStr</w:t>
-      </w:r>
-      <w:proofErr w:type="spellEnd"/>
-      <w:r>
-        <w:rPr>
-          <w:rFonts w:ascii="Arial" w:hAnsi="Arial" w:cs="Arial"/>
-        </w:rPr>
-        <w:t>: {#cognomeIstruttoreStr#}</w:t>
-      </w:r>
-    </w:p>
-    <w:p>
-      <w:pPr>
-        <w:rPr>
-          <w:rFonts w:ascii="Arial" w:hAnsi="Arial" w:cs="Arial"/>
-        </w:rPr>
-      </w:pPr>
-      <w:proofErr w:type="spellStart"/>
-      <w:r>
-        <w:rPr>
-          <w:rFonts w:ascii="Arial" w:hAnsi="Arial" w:cs="Arial"/>
-        </w:rPr>
-        <w:t>nomeIstruttoreStr</w:t>
-      </w:r>
-      <w:proofErr w:type="spellEnd"/>
-      <w:r>
-        <w:rPr>
-          <w:rFonts w:ascii="Arial" w:hAnsi="Arial" w:cs="Arial"/>
-        </w:rPr>
-        <w:t>: {#nomeIstruttoreStr#}</w:t>
-      </w:r>
-    </w:p>
-    <w:p>
-      <w:pPr>
-        <w:rPr>
-          <w:rFonts w:ascii="Arial" w:hAnsi="Arial" w:cs="Arial"/>
-        </w:rPr>
-      </w:pPr>
-      <w:proofErr w:type="spellStart"/>
-      <w:r>
-        <w:rPr>
-          <w:rFonts w:ascii="Arial" w:hAnsi="Arial" w:cs="Arial"/>
-        </w:rPr>
-        <w:t>cognomeRichiedenteStr</w:t>
-      </w:r>
-      <w:proofErr w:type="spellEnd"/>
-      <w:r>
-        <w:rPr>
-          <w:rFonts w:ascii="Arial" w:hAnsi="Arial" w:cs="Arial"/>
-        </w:rPr>
-        <w:t>: {#cognomeRichiedenteStr#}</w:t>
-      </w:r>
-    </w:p>
-    <w:p>
-      <w:pPr>
-        <w:rPr>
-          <w:rFonts w:ascii="Arial" w:hAnsi="Arial" w:cs="Arial"/>
-        </w:rPr>
-      </w:pPr>
-      <w:proofErr w:type="spellStart"/>
-      <w:r>
-        <w:rPr>
-          <w:rFonts w:ascii="Arial" w:hAnsi="Arial" w:cs="Arial"/>
-        </w:rPr>
-        <w:t>nomeRichiedenteStr</w:t>
-      </w:r>
-      <w:proofErr w:type="spellEnd"/>
-      <w:r>
-        <w:rPr>
-          <w:rFonts w:ascii="Arial" w:hAnsi="Arial" w:cs="Arial"/>
-        </w:rPr>
-        <w:t>: {#nomeRichiedenteStr#}</w:t>
-      </w:r>
-    </w:p>
-    <w:p>
-      <w:pPr>
-        <w:rPr>
-          <w:rFonts w:ascii="Arial" w:hAnsi="Arial" w:cs="Arial"/>
-        </w:rPr>
-      </w:pPr>
-      <w:proofErr w:type="spellStart"/>
-      <w:r>
-        <w:rPr>
-          <w:rFonts w:ascii="Arial" w:hAnsi="Arial" w:cs="Arial"/>
-        </w:rPr>
-        <w:t>comuneNascinaRichiedenteStr</w:t>
-      </w:r>
-      <w:proofErr w:type="spellEnd"/>
-      <w:r>
-        <w:rPr>
-          <w:rFonts w:ascii="Arial" w:hAnsi="Arial" w:cs="Arial"/>
-        </w:rPr>
-        <w:t>: {#comuneNascinaRichiedenteStr#}</w:t>
-      </w:r>
-    </w:p>
-    <w:p>
-      <w:pPr>
-        <w:rPr>
-          <w:rFonts w:ascii="Arial" w:hAnsi="Arial" w:cs="Arial"/>
-        </w:rPr>
-      </w:pPr>
-      <w:proofErr w:type="spellStart"/>
-      <w:r>
-        <w:rPr>
-          <w:rFonts w:ascii="Arial" w:hAnsi="Arial" w:cs="Arial"/>
-        </w:rPr>
-        <w:t>dataNascinaRichiedenteStr</w:t>
-      </w:r>
-      <w:proofErr w:type="spellEnd"/>
-      <w:r>
-        <w:rPr>
-          <w:rFonts w:ascii="Arial" w:hAnsi="Arial" w:cs="Arial"/>
-        </w:rPr>
-        <w:t>: {#dataNascinaRichiedenteStr#}</w:t>
-      </w:r>
-    </w:p>
-    <w:p>
-      <w:pPr>
-        <w:rPr>
-          <w:rFonts w:ascii="Arial" w:hAnsi="Arial" w:cs="Arial"/>
-        </w:rPr>
-      </w:pPr>
-      <w:proofErr w:type="spellStart"/>
-      <w:r>
-        <w:rPr>
-          <w:rFonts w:ascii="Arial" w:hAnsi="Arial" w:cs="Arial"/>
-        </w:rPr>
-        <w:t>codiceFiscaleRichiedenteStr</w:t>
-      </w:r>
-      <w:proofErr w:type="spellEnd"/>
-      <w:r>
-        <w:rPr>
-          <w:rFonts w:ascii="Arial" w:hAnsi="Arial" w:cs="Arial"/>
-        </w:rPr>
-        <w:t>: {#codiceFiscaleRichiedenteStr#}</w:t>
-      </w:r>
-    </w:p>
-    <w:p>
-      <w:pPr>
-        <w:rPr>
-          <w:rFonts w:ascii="Arial" w:hAnsi="Arial" w:cs="Arial"/>
-        </w:rPr>
-      </w:pPr>
-      <w:proofErr w:type="spellStart"/>
-      <w:r>
-        <w:rPr>
-          <w:rFonts w:ascii="Arial" w:hAnsi="Arial" w:cs="Arial"/>
-        </w:rPr>
-        <w:t>comuneResidenzaRichiedenteStr</w:t>
-      </w:r>
-      <w:proofErr w:type="spellEnd"/>
-      <w:r>
-        <w:rPr>
-          <w:rFonts w:ascii="Arial" w:hAnsi="Arial" w:cs="Arial"/>
-        </w:rPr>
-        <w:t>: {#comuneResidenzaRichiedenteStr#}</w:t>
-      </w:r>
-    </w:p>
-    <w:p>
-      <w:pPr>
-        <w:rPr>
-          <w:rFonts w:ascii="Arial" w:hAnsi="Arial" w:cs="Arial"/>
-        </w:rPr>
-      </w:pPr>
-      <w:proofErr w:type="spellStart"/>
-      <w:r>
-        <w:rPr>
-          <w:rFonts w:ascii="Arial" w:hAnsi="Arial" w:cs="Arial"/>
-        </w:rPr>
-        <w:t>indirizzoResidenzaRichiedenteStr</w:t>
-      </w:r>
-      <w:proofErr w:type="spellEnd"/>
-      <w:r>
-        <w:rPr>
-          <w:rFonts w:ascii="Arial" w:hAnsi="Arial" w:cs="Arial"/>
-        </w:rPr>
-        <w:t>: {#indirizzoResidenzaRichiedenteStr#}</w:t>
-      </w:r>
-    </w:p>
-    <w:p>
-      <w:pPr>
-        <w:rPr>
-          <w:rFonts w:ascii="Arial" w:hAnsi="Arial" w:cs="Arial"/>
-        </w:rPr>
-      </w:pPr>
-      <w:proofErr w:type="spellStart"/>
-      <w:r>
-        <w:rPr>
-          <w:rFonts w:ascii="Arial" w:hAnsi="Arial" w:cs="Arial"/>
-        </w:rPr>
-        <w:t>indrizzoAbitazioneDesignataStr</w:t>
-      </w:r>
-      <w:proofErr w:type="spellEnd"/>
-      <w:r>
-        <w:rPr>
-          <w:rFonts w:ascii="Arial" w:hAnsi="Arial" w:cs="Arial"/>
-        </w:rPr>
-        <w:t>: {#indrizzoAbitazioneDesignataStr#}</w:t>
-      </w:r>
-    </w:p>
-    <w:p>
-      <w:pPr>
-        <w:rPr>
-          <w:rFonts w:ascii="Arial" w:hAnsi="Arial" w:cs="Arial"/>
-        </w:rPr>
-      </w:pPr>
-      <w:proofErr w:type="spellStart"/>
-      <w:r>
-        <w:rPr>
-          <w:rFonts w:ascii="Arial" w:hAnsi="Arial" w:cs="Arial"/>
-        </w:rPr>
-        <w:t>catastoFoglioAbitazioneDesignataStr</w:t>
-      </w:r>
-      <w:proofErr w:type="spellEnd"/>
-      <w:r>
-        <w:rPr>
-          <w:rFonts w:ascii="Arial" w:hAnsi="Arial" w:cs="Arial"/>
-        </w:rPr>
-        <w:t>: {#catastoFoglioAbitazioneDesignataStr#}</w:t>
-      </w:r>
-    </w:p>
-    <w:p>
-      <w:pPr>
-        <w:rPr>
-          <w:rFonts w:ascii="Arial" w:hAnsi="Arial" w:cs="Arial"/>
-        </w:rPr>
-      </w:pPr>
-      <w:proofErr w:type="spellStart"/>
-      <w:r>
-        <w:rPr>
-          <w:rFonts w:ascii="Arial" w:hAnsi="Arial" w:cs="Arial"/>
-        </w:rPr>
-        <w:t>catastoMappaleAbitazioneDesignataStr</w:t>
-      </w:r>
-      <w:proofErr w:type="spellEnd"/>
-      <w:r>
-        <w:rPr>
-          <w:rFonts w:ascii="Arial" w:hAnsi="Arial" w:cs="Arial"/>
-        </w:rPr>
-        <w:t>: {#catastoMappaleAbitazioneDesignataStr#}</w:t>
-      </w:r>
-    </w:p>
-    <w:p>
-      <w:pPr>
-        <w:rPr>
-          <w:rFonts w:ascii="Arial" w:hAnsi="Arial" w:cs="Arial"/>
-        </w:rPr>
-      </w:pPr>
-      <w:proofErr w:type="spellStart"/>
-      <w:r>
-        <w:rPr>
-          <w:rFonts w:ascii="Arial" w:hAnsi="Arial" w:cs="Arial"/>
-        </w:rPr>
-        <w:t>catastoSubalternoAbitazioneDesignataStr</w:t>
-      </w:r>
-      <w:proofErr w:type="spellEnd"/>
-      <w:r>
-        <w:rPr>
-          <w:rFonts w:ascii="Arial" w:hAnsi="Arial" w:cs="Arial"/>
-        </w:rPr>
-        <w:t>: {#catastoSubalternoAbitazioneDesignataStr#}</w:t>
-      </w:r>
-    </w:p>
-    <w:p>
-      <w:pPr>
-        <w:rPr>
-          <w:rFonts w:ascii="Arial" w:hAnsi="Arial" w:cs="Arial"/>
-        </w:rPr>
-      </w:pPr>
-      <w:proofErr w:type="spellStart"/>
-      <w:r>
-        <w:rPr>
-          <w:rFonts w:ascii="Arial" w:hAnsi="Arial" w:cs="Arial"/>
-        </w:rPr>
-        <w:t>catastoCategoriaAbitazioneDesignataStr</w:t>
-      </w:r>
-      <w:proofErr w:type="spellEnd"/>
-      <w:r>
-        <w:rPr>
-          <w:rFonts w:ascii="Arial" w:hAnsi="Arial" w:cs="Arial"/>
-        </w:rPr>
-        <w:t>: {#catastoCategoriaAbitazioneDesignataStr#}</w:t>
-      </w:r>
-    </w:p>
-    <w:p>
-      <w:pPr>
-        <w:rPr>
-          <w:rFonts w:ascii="Arial" w:hAnsi="Arial" w:cs="Arial"/>
-        </w:rPr>
-      </w:pPr>
-      <w:proofErr w:type="spellStart"/>
+      <w:r>
+        <w:rPr>
+          <w:rFonts w:ascii="Arial" w:hAnsi="Arial" w:cs="Arial"/>
+        </w:rPr>
+        <w:t>numeroTagliandoStr</w:t>
+      </w:r>
+      <w:r>
+        <w:rPr>
+          <w:rFonts w:ascii="Arial" w:hAnsi="Arial" w:cs="Arial"/>
+        </w:rPr>
+        <w:t>: {#</w:t>
+      </w:r>
+      <w:r>
+        <w:rPr>
+          <w:rFonts w:ascii="Arial" w:hAnsi="Arial" w:cs="Arial"/>
+        </w:rPr>
+        <w:t>numeroTagliandoStr</w:t>
+      </w:r>
+      <w:r>
+        <w:rPr>
+          <w:rFonts w:ascii="Arial" w:hAnsi="Arial" w:cs="Arial"/>
+        </w:rPr>
+        <w:t>#}</w:t>
+      </w:r>
+    </w:p>
+    <w:p>
+      <w:pPr>
+        <w:rPr>
+          <w:rFonts w:ascii="Arial" w:hAnsi="Arial" w:cs="Arial"/>
+        </w:rPr>
+      </w:pPr>
+      <w:r>
+        <w:rPr>
+          <w:rFonts w:ascii="Arial" w:hAnsi="Arial" w:cs="Arial"/>
+        </w:rPr>
+        <w:t>descrizionePermessoStr: {#descrizionePermessoStr#}</w:t>
+      </w:r>
+    </w:p>
+    <w:p>
+      <w:pPr>
+        <w:rPr>
+          <w:rFonts w:ascii="Arial" w:hAnsi="Arial" w:cs="Arial"/>
+        </w:rPr>
+      </w:pPr>
+      <w:r>
+        <w:rPr>
+          <w:rFonts w:ascii="Arial" w:hAnsi="Arial" w:cs="Arial"/>
+        </w:rPr>
+        <w:t>tipologiaDomanda: {#tipologiaDomanda#}</w:t>
+      </w:r>
+    </w:p>
+    <w:p>
+      <w:pPr>
+        <w:rPr>
+          <w:rFonts w:ascii="Arial" w:hAnsi="Arial" w:cs="Arial"/>
+        </w:rPr>
+      </w:pPr>
+      <w:r>
+        <w:rPr>
+          <w:rFonts w:ascii="Arial" w:hAnsi="Arial" w:cs="Arial"/>
+        </w:rPr>
+        <w:t>dataProtocolloStr: {#dataProtocolloStr#}</w:t>
+      </w:r>
+    </w:p>
+    <w:p>
+      <w:pPr>
+        <w:rPr>
+          <w:rFonts w:ascii="Arial" w:hAnsi="Arial" w:cs="Arial"/>
+        </w:rPr>
+      </w:pPr>
+      <w:r>
+        <w:rPr>
+          <w:rFonts w:ascii="Arial" w:hAnsi="Arial" w:cs="Arial"/>
+        </w:rPr>
+        <w:t>numeroProtocolloStr: {#numeroProtocolloStr#}</w:t>
+      </w:r>
+    </w:p>
+    <w:p>
+      <w:pPr>
+        <w:rPr>
+          <w:rFonts w:ascii="Arial" w:hAnsi="Arial" w:cs="Arial"/>
+        </w:rPr>
+      </w:pPr>
+      <w:r>
+        <w:rPr>
+          <w:rFonts w:ascii="Arial" w:hAnsi="Arial" w:cs="Arial"/>
+        </w:rPr>
+        <w:t>dataCompletamentoStr</w:t>
+      </w:r>
+      <w:r>
+        <w:rPr>
+          <w:rFonts w:ascii="Arial" w:hAnsi="Arial" w:cs="Arial"/>
+        </w:rPr>
+        <w:t>: {#</w:t>
+      </w:r>
+      <w:r>
+        <w:rPr>
+          <w:rFonts w:ascii="Arial" w:hAnsi="Arial" w:cs="Arial"/>
+        </w:rPr>
+        <w:t>dataCompletamentoStr</w:t>
+      </w:r>
+      <w:r>
+        <w:rPr>
+          <w:rFonts w:ascii="Arial" w:hAnsi="Arial" w:cs="Arial"/>
+        </w:rPr>
+        <w:t>#}</w:t>
+      </w:r>
+    </w:p>
+    <w:p>
+      <w:pPr>
+        <w:rPr>
+          <w:rFonts w:ascii="Arial" w:hAnsi="Arial" w:cs="Arial"/>
+        </w:rPr>
+      </w:pPr>
+      <w:r>
+        <w:rPr>
+          <w:rFonts w:ascii="Arial" w:hAnsi="Arial" w:cs="Arial"/>
+        </w:rPr>
+        <w:t>dataInizioValiditaStr: {#dataInizioValiditaStr#}</w:t>
+      </w:r>
+    </w:p>
+    <w:p>
+      <w:pPr>
+        <w:rPr>
+          <w:rFonts w:ascii="Arial" w:hAnsi="Arial" w:cs="Arial"/>
+        </w:rPr>
+      </w:pPr>
+      <w:r>
+        <w:rPr>
+          <w:rFonts w:ascii="Arial" w:hAnsi="Arial" w:cs="Arial"/>
+        </w:rPr>
+        <w:t>dataFineValiditaStr: {#dataFineValiditaStr#}</w:t>
+      </w:r>
+    </w:p>
+    <w:p>
+      <w:pPr>
+        <w:rPr>
+          <w:rFonts w:ascii="Arial" w:hAnsi="Arial" w:cs="Arial"/>
+        </w:rPr>
+      </w:pPr>
+      <w:r>
+        <w:rPr>
+          <w:rFonts w:ascii="Arial" w:hAnsi="Arial" w:cs="Arial"/>
+        </w:rPr>
+        <w:t>cognomeIstruttoreStr: {#cognomeIstruttoreStr#}</w:t>
+      </w:r>
+    </w:p>
+    <w:p>
+      <w:pPr>
+        <w:rPr>
+          <w:rFonts w:ascii="Arial" w:hAnsi="Arial" w:cs="Arial"/>
+        </w:rPr>
+      </w:pPr>
+      <w:r>
+        <w:rPr>
+          <w:rFonts w:ascii="Arial" w:hAnsi="Arial" w:cs="Arial"/>
+        </w:rPr>
+        <w:t>nomeIstruttoreStr: {#nomeIstruttoreStr#}</w:t>
+      </w:r>
+    </w:p>
+    <w:p>
+      <w:pPr>
+        <w:rPr>
+          <w:rFonts w:ascii="Arial" w:hAnsi="Arial" w:cs="Arial"/>
+        </w:rPr>
+      </w:pPr>
+      <w:r>
+        <w:rPr>
+          <w:rFonts w:ascii="Arial" w:hAnsi="Arial" w:cs="Arial"/>
+        </w:rPr>
+        <w:t>cognomeRichiedenteStr: {#cognomeRichiedenteStr#}</w:t>
+      </w:r>
+    </w:p>
+    <w:p>
+      <w:pPr>
+        <w:rPr>
+          <w:rFonts w:ascii="Arial" w:hAnsi="Arial" w:cs="Arial"/>
+        </w:rPr>
+      </w:pPr>
+      <w:r>
+        <w:rPr>
+          <w:rFonts w:ascii="Arial" w:hAnsi="Arial" w:cs="Arial"/>
+        </w:rPr>
+        <w:t>nomeRichiedenteStr: {#nomeRichiedenteStr#}</w:t>
+      </w:r>
+    </w:p>
+    <w:p>
+      <w:pPr>
+        <w:rPr>
+          <w:rFonts w:ascii="Arial" w:hAnsi="Arial" w:cs="Arial"/>
+        </w:rPr>
+      </w:pPr>
+      <w:r>
+        <w:rPr>
+          <w:rFonts w:ascii="Arial" w:hAnsi="Arial" w:cs="Arial"/>
+        </w:rPr>
+        <w:t>comuneNascitaRichiedenteStr</w:t>
+      </w:r>
+      <w:r>
+        <w:rPr>
+          <w:rFonts w:ascii="Arial" w:hAnsi="Arial" w:cs="Arial"/>
+        </w:rPr>
+        <w:t>: {#</w:t>
+      </w:r>
+      <w:r>
+        <w:rPr>
+          <w:rFonts w:ascii="Arial" w:hAnsi="Arial" w:cs="Arial"/>
+        </w:rPr>
+        <w:t>comuneNascitaRichiedenteStr</w:t>
+      </w:r>
+      <w:r>
+        <w:rPr>
+          <w:rFonts w:ascii="Arial" w:hAnsi="Arial" w:cs="Arial"/>
+        </w:rPr>
+        <w:t>#}</w:t>
+      </w:r>
+    </w:p>
+    <w:p>
+      <w:pPr>
+        <w:rPr>
+          <w:rFonts w:ascii="Arial" w:hAnsi="Arial" w:cs="Arial"/>
+        </w:rPr>
+      </w:pPr>
+      <w:r>
+        <w:rPr>
+          <w:rFonts w:ascii="Arial" w:hAnsi="Arial" w:cs="Arial"/>
+        </w:rPr>
+        <w:t>dataNascitaRichiedenteStr</w:t>
+      </w:r>
+      <w:r>
+        <w:rPr>
+          <w:rFonts w:ascii="Arial" w:hAnsi="Arial" w:cs="Arial"/>
+        </w:rPr>
+        <w:t>: {#</w:t>
+      </w:r>
+      <w:r>
+        <w:rPr>
+          <w:rFonts w:ascii="Arial" w:hAnsi="Arial" w:cs="Arial"/>
+        </w:rPr>
+        <w:t>dataNascitaRichiedenteStr</w:t>
+      </w:r>
+      <w:r>
+        <w:rPr>
+          <w:rFonts w:ascii="Arial" w:hAnsi="Arial" w:cs="Arial"/>
+        </w:rPr>
+        <w:t>#}</w:t>
+      </w:r>
+    </w:p>
+    <w:p>
+      <w:pPr>
+        <w:rPr>
+          <w:rFonts w:ascii="Arial" w:hAnsi="Arial" w:cs="Arial"/>
+        </w:rPr>
+      </w:pPr>
+      <w:r>
+        <w:rPr>
+          <w:rFonts w:ascii="Arial" w:hAnsi="Arial" w:cs="Arial"/>
+        </w:rPr>
+        <w:t>codiceFiscaleRichiedenteStr: {#codiceFiscaleRichiedenteStr#}</w:t>
+      </w:r>
+    </w:p>
+    <w:p>
+      <w:pPr>
+        <w:rPr>
+          <w:rFonts w:ascii="Arial" w:hAnsi="Arial" w:cs="Arial"/>
+        </w:rPr>
+      </w:pPr>
+      <w:r>
+        <w:rPr>
+          <w:rFonts w:ascii="Arial" w:hAnsi="Arial" w:cs="Arial"/>
+        </w:rPr>
+        <w:t>comuneResidenzaRichiedenteStr: {#comuneResidenzaRichiedenteStr#}</w:t>
+      </w:r>
+    </w:p>
+    <w:p>
+      <w:pPr>
+        <w:rPr>
+          <w:rFonts w:ascii="Arial" w:hAnsi="Arial" w:cs="Arial"/>
+        </w:rPr>
+      </w:pPr>
+      <w:r>
+        <w:rPr>
+          <w:rFonts w:ascii="Arial" w:hAnsi="Arial" w:cs="Arial"/>
+        </w:rPr>
+        <w:t>indirizzoResidenzaRichiedenteStr: {#indirizzoResidenzaRichiedenteStr#}</w:t>
+      </w:r>
+    </w:p>
+    <w:p>
+      <w:pPr>
+        <w:rPr>
+          <w:rFonts w:ascii="Arial" w:hAnsi="Arial" w:cs="Arial"/>
+        </w:rPr>
+      </w:pPr>
+      <w:r>
+        <w:rPr>
+          <w:rFonts w:ascii="Arial" w:hAnsi="Arial" w:cs="Arial"/>
+        </w:rPr>
+        <w:t>ind</w:t>
+      </w:r>
+      <w:r>
+        <w:rPr>
+          <w:rFonts w:ascii="Arial" w:hAnsi="Arial" w:cs="Arial"/>
+        </w:rPr>
+        <w:t>i</w:t>
+      </w:r>
+      <w:r>
+        <w:rPr>
+          <w:rFonts w:ascii="Arial" w:hAnsi="Arial" w:cs="Arial"/>
+        </w:rPr>
+        <w:t>rizzoAbitazioneDesignataStr: {#ind</w:t>
+      </w:r>
+      <w:r>
+        <w:rPr>
+          <w:rFonts w:ascii="Arial" w:hAnsi="Arial" w:cs="Arial"/>
+        </w:rPr>
+        <w:t>i</w:t>
+      </w:r>
+      <w:r>
+        <w:rPr>
+          <w:rFonts w:ascii="Arial" w:hAnsi="Arial" w:cs="Arial"/>
+        </w:rPr>
+        <w:t>rizzoAbitazioneDesignataStr#}</w:t>
+      </w:r>
+    </w:p>
+    <w:p>
+      <w:pPr>
+        <w:rPr>
+          <w:rFonts w:ascii="Arial" w:hAnsi="Arial" w:cs="Arial"/>
+        </w:rPr>
+      </w:pPr>
+      <w:r>
+        <w:rPr>
+          <w:rFonts w:ascii="Arial" w:hAnsi="Arial" w:cs="Arial"/>
+        </w:rPr>
+        <w:t>catastoFoglioAbitazioneDesignataStr: {#catastoFoglioAbitazioneDesignataStr#}</w:t>
+      </w:r>
+    </w:p>
+    <w:p>
+      <w:pPr>
+        <w:rPr>
+          <w:rFonts w:ascii="Arial" w:hAnsi="Arial" w:cs="Arial"/>
+        </w:rPr>
+      </w:pPr>
+      <w:r>
+        <w:rPr>
+          <w:rFonts w:ascii="Arial" w:hAnsi="Arial" w:cs="Arial"/>
+        </w:rPr>
+        <w:t>catastoMappaleAbitazioneDesignataStr: {#catastoMappaleAbitazioneDesignataStr#}</w:t>
+      </w:r>
+    </w:p>
+    <w:p>
+      <w:pPr>
+        <w:rPr>
+          <w:rFonts w:ascii="Arial" w:hAnsi="Arial" w:cs="Arial"/>
+        </w:rPr>
+      </w:pPr>
+      <w:r>
+        <w:rPr>
+          <w:rFonts w:ascii="Arial" w:hAnsi="Arial" w:cs="Arial"/>
+        </w:rPr>
+        <w:t>catastoSubalternoAbitazioneDesignataStr: {#catastoSubalternoAbitazioneDesignataStr#}</w:t>
+      </w:r>
+    </w:p>
+    <w:p>
+      <w:pPr>
+        <w:rPr>
+          <w:rFonts w:ascii="Arial" w:hAnsi="Arial" w:cs="Arial"/>
+        </w:rPr>
+      </w:pPr>
+      <w:r>
+        <w:rPr>
+          <w:rFonts w:ascii="Arial" w:hAnsi="Arial" w:cs="Arial"/>
+        </w:rPr>
+        <w:t>catastoCategoriaAbitazioneDesignataStr: {#catastoCategoriaAbitazioneDesignataStr#}</w:t>
+      </w:r>
+    </w:p>
+    <w:p>
+      <w:pPr>
+        <w:rPr>
+          <w:rFonts w:ascii="Arial" w:hAnsi="Arial" w:cs="Arial"/>
+        </w:rPr>
+      </w:pPr>
       <w:r>
         <w:rPr>
           <w:rFonts w:ascii="Arial" w:hAnsi="Arial" w:cs="Arial"/>
         </w:rPr>
         <w:t>verificationUrl</w:t>
       </w:r>
-      <w:proofErr w:type="spellEnd"/>
       <w:r>
         <w:rPr>
           <w:rFonts w:ascii="Arial" w:hAnsi="Arial" w:cs="Arial"/>
@@ -507,35 +425,7 @@
         <w:rPr>
           <w:rFonts w:ascii="Arial" w:hAnsi="Arial" w:cs="Arial"/>
         </w:rPr>
-        <w:t xml:space="preserve">Targhe autorizzate: {#FOR </w:t>
-      </w:r>
-      <w:proofErr w:type="spellStart"/>
-      <w:r>
-        <w:rPr>
-          <w:rFonts w:ascii="Arial" w:hAnsi="Arial" w:cs="Arial"/>
-        </w:rPr>
-        <w:t>targaObj</w:t>
-      </w:r>
-      <w:proofErr w:type="spellEnd"/>
-      <w:r>
-        <w:rPr>
-          <w:rFonts w:ascii="Arial" w:hAnsi="Arial" w:cs="Arial"/>
-        </w:rPr>
-        <w:t xml:space="preserve"> IN </w:t>
-      </w:r>
-      <w:proofErr w:type="spellStart"/>
-      <w:r>
-        <w:rPr>
-          <w:rFonts w:ascii="Arial" w:hAnsi="Arial" w:cs="Arial"/>
-        </w:rPr>
-        <w:t>targheArr</w:t>
-      </w:r>
-      <w:proofErr w:type="spellEnd"/>
-      <w:r>
-        <w:rPr>
-          <w:rFonts w:ascii="Arial" w:hAnsi="Arial" w:cs="Arial"/>
-        </w:rPr>
-        <w:t>#}</w:t>
+        <w:t>Targhe autorizzate: {#FOR targaObj IN targheArr#}</w:t>
       </w:r>
       <w:r>
         <w:rPr>
@@ -547,21 +437,7 @@
         <w:rPr>
           <w:rFonts w:ascii="Arial" w:hAnsi="Arial" w:cs="Arial"/>
         </w:rPr>
-        <w:t>{#$idx + 1#}): {#INS $</w:t>
-      </w:r>
-      <w:proofErr w:type="spellStart"/>
-      <w:r>
-        <w:rPr>
-          <w:rFonts w:ascii="Arial" w:hAnsi="Arial" w:cs="Arial"/>
-        </w:rPr>
-        <w:t>targaObj.targaStr</w:t>
-      </w:r>
-      <w:proofErr w:type="spellEnd"/>
-      <w:r>
-        <w:rPr>
-          <w:rFonts w:ascii="Arial" w:hAnsi="Arial" w:cs="Arial"/>
-        </w:rPr>
-        <w:t>#}</w:t>
+        <w:t>{#$idx + 1#}): {#INS $targaObj.targaStr#}</w:t>
       </w:r>
       <w:r>
         <w:rPr>
@@ -573,21 +449,7 @@
         <w:rPr>
           <w:rFonts w:ascii="Arial" w:hAnsi="Arial" w:cs="Arial"/>
         </w:rPr>
-        <w:t xml:space="preserve">{#END-FOR </w:t>
-      </w:r>
-      <w:proofErr w:type="spellStart"/>
-      <w:r>
-        <w:rPr>
-          <w:rFonts w:ascii="Arial" w:hAnsi="Arial" w:cs="Arial"/>
-        </w:rPr>
-        <w:t>targaObj</w:t>
-      </w:r>
-      <w:proofErr w:type="spellEnd"/>
-      <w:r>
-        <w:rPr>
-          <w:rFonts w:ascii="Arial" w:hAnsi="Arial" w:cs="Arial"/>
-        </w:rPr>
-        <w:t>#}</w:t>
+        <w:t>{#END-FOR targaObj#}</w:t>
       </w:r>
     </w:p>
     <w:p>
@@ -1447,6 +1309,7 @@
   <w:style w:type="character" w:default="1" w:styleId="Carpredefinitoparagrafo">
     <w:name w:val="Default Paragraph Font"/>
     <w:uiPriority w:val="1"/>
+    <w:semiHidden/>
     <w:unhideWhenUsed/>
   </w:style>
   <w:style w:type="table" w:default="1" w:styleId="Tabellanormale">

</xml_diff>

<commit_message>
Verisione 0.2.0 Scansione QR Code con fotocamera
Fix link a voucherUrl nei modelli predefiniti
Fix upload modelli
Aggiunta possibilità di scegliere il tagliando nella creazione dei rilievi tramite il QR Code
</commit_message>
<xml_diff>
--- a/to-backend/docx_examples/default_templates/default_autorizzazione.docx
+++ b/to-backend/docx_examples/default_templates/default_autorizzazione.docx
@@ -413,6 +413,43 @@
           <w:rFonts w:ascii="Arial" w:hAnsi="Arial" w:cs="Arial"/>
         </w:rPr>
         <w:t>#}</w:t>
+      </w:r>
+    </w:p>
+    <w:p>
+      <w:pPr>
+        <w:rPr>
+          <w:rFonts w:ascii="Arial" w:hAnsi="Arial" w:cs="Arial"/>
+        </w:rPr>
+      </w:pPr>
+      <w:r>
+        <w:rPr>
+          <w:rFonts w:ascii="Arial" w:hAnsi="Arial" w:cs="Arial"/>
+        </w:rPr>
+        <w:t xml:space="preserve">verificationUrlLink: </w:t>
+      </w:r>
+      <w:r>
+        <w:rPr>
+          <w:rFonts w:ascii="Arial" w:hAnsi="Arial" w:cs="Arial"/>
+        </w:rPr>
+        <w:t xml:space="preserve">{#LINK ({url: verificationUrl, label: </w:t>
+      </w:r>
+      <w:r>
+        <w:rPr>
+          <w:rFonts w:ascii="Arial" w:hAnsi="Arial" w:cs="Arial"/>
+        </w:rPr>
+        <w:t>verificationUrl</w:t>
+      </w:r>
+      <w:r>
+        <w:rPr>
+          <w:rFonts w:ascii="Arial" w:hAnsi="Arial" w:cs="Arial"/>
+        </w:rPr>
+        <w:t>}</w:t>
+      </w:r>
+      <w:r>
+        <w:rPr>
+          <w:rFonts w:ascii="Arial" w:hAnsi="Arial" w:cs="Arial"/>
+        </w:rPr>
+        <w:t>)#}</w:t>
       </w:r>
     </w:p>
     <w:p>
@@ -1309,7 +1346,6 @@
   <w:style w:type="character" w:default="1" w:styleId="Carpredefinitoparagrafo">
     <w:name w:val="Default Paragraph Font"/>
     <w:uiPriority w:val="1"/>
-    <w:semiHidden/>
     <w:unhideWhenUsed/>
   </w:style>
   <w:style w:type="table" w:default="1" w:styleId="Tabellanormale">

</xml_diff>

<commit_message>
Aggiunto campo veicoli simultanei al modello
</commit_message>
<xml_diff>
--- a/to-backend/docx_examples/default_templates/default_autorizzazione.docx
+++ b/to-backend/docx_examples/default_templates/default_autorizzazione.docx
@@ -382,6 +382,37 @@
           <w:rFonts w:ascii="Arial" w:hAnsi="Arial" w:cs="Arial"/>
         </w:rPr>
         <w:t>catastoCategoriaAbitazioneDesignataStr: {#catastoCategoriaAbitazioneDesignataStr#}</w:t>
+      </w:r>
+    </w:p>
+    <w:p>
+      <w:pPr>
+        <w:rPr>
+          <w:rFonts w:ascii="Arial" w:hAnsi="Arial" w:cs="Arial"/>
+        </w:rPr>
+      </w:pPr>
+      <w:r>
+        <w:rPr>
+          <w:rFonts w:ascii="Arial" w:hAnsi="Arial" w:cs="Arial"/>
+        </w:rPr>
+        <w:t>veicoliSimultanei</w:t>
+      </w:r>
+      <w:r>
+        <w:rPr>
+          <w:rFonts w:ascii="Arial" w:hAnsi="Arial" w:cs="Arial"/>
+        </w:rPr>
+        <w:t>: {#</w:t>
+      </w:r>
+      <w:r>
+        <w:rPr>
+          <w:rFonts w:ascii="Arial" w:hAnsi="Arial" w:cs="Arial"/>
+        </w:rPr>
+        <w:t>veicoliSimultanei</w:t>
+      </w:r>
+      <w:r>
+        <w:rPr>
+          <w:rFonts w:ascii="Arial" w:hAnsi="Arial" w:cs="Arial"/>
+        </w:rPr>
+        <w:t>#}</w:t>
       </w:r>
     </w:p>
     <w:p>

</xml_diff>

<commit_message>
Aggiunto campo per ragione sociale e cf giuridica nel modello
</commit_message>
<xml_diff>
--- a/to-backend/docx_examples/default_templates/default_autorizzazione.docx
+++ b/to-backend/docx_examples/default_templates/default_autorizzazione.docx
@@ -8,12 +8,14 @@
           <w:rFonts w:ascii="Arial" w:hAnsi="Arial" w:cs="Arial"/>
         </w:rPr>
       </w:pPr>
+      <w:proofErr w:type="spellStart"/>
       <w:r>
         <w:rPr>
           <w:rFonts w:ascii="Arial" w:hAnsi="Arial" w:cs="Arial"/>
         </w:rPr>
         <w:t>numeroTagliandoStr</w:t>
       </w:r>
+      <w:proofErr w:type="spellEnd"/>
       <w:r>
         <w:rPr>
           <w:rFonts w:ascii="Arial" w:hAnsi="Arial" w:cs="Arial"/>
@@ -39,64 +41,98 @@
           <w:rFonts w:ascii="Arial" w:hAnsi="Arial" w:cs="Arial"/>
         </w:rPr>
       </w:pPr>
-      <w:r>
-        <w:rPr>
-          <w:rFonts w:ascii="Arial" w:hAnsi="Arial" w:cs="Arial"/>
-        </w:rPr>
-        <w:t>descrizionePermessoStr: {#descrizionePermessoStr#}</w:t>
-      </w:r>
-    </w:p>
-    <w:p>
-      <w:pPr>
-        <w:rPr>
-          <w:rFonts w:ascii="Arial" w:hAnsi="Arial" w:cs="Arial"/>
-        </w:rPr>
-      </w:pPr>
-      <w:r>
-        <w:rPr>
-          <w:rFonts w:ascii="Arial" w:hAnsi="Arial" w:cs="Arial"/>
-        </w:rPr>
-        <w:t>tipologiaDomanda: {#tipologiaDomanda#}</w:t>
-      </w:r>
-    </w:p>
-    <w:p>
-      <w:pPr>
-        <w:rPr>
-          <w:rFonts w:ascii="Arial" w:hAnsi="Arial" w:cs="Arial"/>
-        </w:rPr>
-      </w:pPr>
-      <w:r>
-        <w:rPr>
-          <w:rFonts w:ascii="Arial" w:hAnsi="Arial" w:cs="Arial"/>
-        </w:rPr>
-        <w:t>dataProtocolloStr: {#dataProtocolloStr#}</w:t>
-      </w:r>
-    </w:p>
-    <w:p>
-      <w:pPr>
-        <w:rPr>
-          <w:rFonts w:ascii="Arial" w:hAnsi="Arial" w:cs="Arial"/>
-        </w:rPr>
-      </w:pPr>
-      <w:r>
-        <w:rPr>
-          <w:rFonts w:ascii="Arial" w:hAnsi="Arial" w:cs="Arial"/>
-        </w:rPr>
-        <w:t>numeroProtocolloStr: {#numeroProtocolloStr#}</w:t>
-      </w:r>
-    </w:p>
-    <w:p>
-      <w:pPr>
-        <w:rPr>
-          <w:rFonts w:ascii="Arial" w:hAnsi="Arial" w:cs="Arial"/>
-        </w:rPr>
-      </w:pPr>
+      <w:proofErr w:type="spellStart"/>
+      <w:r>
+        <w:rPr>
+          <w:rFonts w:ascii="Arial" w:hAnsi="Arial" w:cs="Arial"/>
+        </w:rPr>
+        <w:t>descrizionePermessoStr</w:t>
+      </w:r>
+      <w:proofErr w:type="spellEnd"/>
+      <w:r>
+        <w:rPr>
+          <w:rFonts w:ascii="Arial" w:hAnsi="Arial" w:cs="Arial"/>
+        </w:rPr>
+        <w:t>: {#descrizionePermessoStr#}</w:t>
+      </w:r>
+    </w:p>
+    <w:p>
+      <w:pPr>
+        <w:rPr>
+          <w:rFonts w:ascii="Arial" w:hAnsi="Arial" w:cs="Arial"/>
+        </w:rPr>
+      </w:pPr>
+      <w:proofErr w:type="spellStart"/>
+      <w:r>
+        <w:rPr>
+          <w:rFonts w:ascii="Arial" w:hAnsi="Arial" w:cs="Arial"/>
+        </w:rPr>
+        <w:t>tipologiaDomanda</w:t>
+      </w:r>
+      <w:proofErr w:type="spellEnd"/>
+      <w:r>
+        <w:rPr>
+          <w:rFonts w:ascii="Arial" w:hAnsi="Arial" w:cs="Arial"/>
+        </w:rPr>
+        <w:t>: {#tipologiaDomanda#}</w:t>
+      </w:r>
+    </w:p>
+    <w:p>
+      <w:pPr>
+        <w:rPr>
+          <w:rFonts w:ascii="Arial" w:hAnsi="Arial" w:cs="Arial"/>
+        </w:rPr>
+      </w:pPr>
+      <w:proofErr w:type="spellStart"/>
+      <w:r>
+        <w:rPr>
+          <w:rFonts w:ascii="Arial" w:hAnsi="Arial" w:cs="Arial"/>
+        </w:rPr>
+        <w:t>dataProtocolloStr</w:t>
+      </w:r>
+      <w:proofErr w:type="spellEnd"/>
+      <w:r>
+        <w:rPr>
+          <w:rFonts w:ascii="Arial" w:hAnsi="Arial" w:cs="Arial"/>
+        </w:rPr>
+        <w:t>: {#dataProtocolloStr#}</w:t>
+      </w:r>
+    </w:p>
+    <w:p>
+      <w:pPr>
+        <w:rPr>
+          <w:rFonts w:ascii="Arial" w:hAnsi="Arial" w:cs="Arial"/>
+        </w:rPr>
+      </w:pPr>
+      <w:proofErr w:type="spellStart"/>
+      <w:r>
+        <w:rPr>
+          <w:rFonts w:ascii="Arial" w:hAnsi="Arial" w:cs="Arial"/>
+        </w:rPr>
+        <w:t>numeroProtocolloStr</w:t>
+      </w:r>
+      <w:proofErr w:type="spellEnd"/>
+      <w:r>
+        <w:rPr>
+          <w:rFonts w:ascii="Arial" w:hAnsi="Arial" w:cs="Arial"/>
+        </w:rPr>
+        <w:t>: {#numeroProtocolloStr#}</w:t>
+      </w:r>
+    </w:p>
+    <w:p>
+      <w:pPr>
+        <w:rPr>
+          <w:rFonts w:ascii="Arial" w:hAnsi="Arial" w:cs="Arial"/>
+        </w:rPr>
+      </w:pPr>
+      <w:proofErr w:type="spellStart"/>
       <w:r>
         <w:rPr>
           <w:rFonts w:ascii="Arial" w:hAnsi="Arial" w:cs="Arial"/>
         </w:rPr>
         <w:t>dataCompletamentoStr</w:t>
       </w:r>
+      <w:proofErr w:type="spellEnd"/>
       <w:r>
         <w:rPr>
           <w:rFonts w:ascii="Arial" w:hAnsi="Arial" w:cs="Arial"/>
@@ -122,90 +158,218 @@
           <w:rFonts w:ascii="Arial" w:hAnsi="Arial" w:cs="Arial"/>
         </w:rPr>
       </w:pPr>
-      <w:r>
-        <w:rPr>
-          <w:rFonts w:ascii="Arial" w:hAnsi="Arial" w:cs="Arial"/>
-        </w:rPr>
-        <w:t>dataInizioValiditaStr: {#dataInizioValiditaStr#}</w:t>
-      </w:r>
-    </w:p>
-    <w:p>
-      <w:pPr>
-        <w:rPr>
-          <w:rFonts w:ascii="Arial" w:hAnsi="Arial" w:cs="Arial"/>
-        </w:rPr>
-      </w:pPr>
-      <w:r>
-        <w:rPr>
-          <w:rFonts w:ascii="Arial" w:hAnsi="Arial" w:cs="Arial"/>
-        </w:rPr>
-        <w:t>dataFineValiditaStr: {#dataFineValiditaStr#}</w:t>
-      </w:r>
-    </w:p>
-    <w:p>
-      <w:pPr>
-        <w:rPr>
-          <w:rFonts w:ascii="Arial" w:hAnsi="Arial" w:cs="Arial"/>
-        </w:rPr>
-      </w:pPr>
-      <w:r>
-        <w:rPr>
-          <w:rFonts w:ascii="Arial" w:hAnsi="Arial" w:cs="Arial"/>
-        </w:rPr>
-        <w:t>cognomeIstruttoreStr: {#cognomeIstruttoreStr#}</w:t>
-      </w:r>
-    </w:p>
-    <w:p>
-      <w:pPr>
-        <w:rPr>
-          <w:rFonts w:ascii="Arial" w:hAnsi="Arial" w:cs="Arial"/>
-        </w:rPr>
-      </w:pPr>
-      <w:r>
-        <w:rPr>
-          <w:rFonts w:ascii="Arial" w:hAnsi="Arial" w:cs="Arial"/>
-        </w:rPr>
-        <w:t>nomeIstruttoreStr: {#nomeIstruttoreStr#}</w:t>
-      </w:r>
-    </w:p>
-    <w:p>
-      <w:pPr>
-        <w:rPr>
-          <w:rFonts w:ascii="Arial" w:hAnsi="Arial" w:cs="Arial"/>
-        </w:rPr>
-      </w:pPr>
-      <w:r>
-        <w:rPr>
-          <w:rFonts w:ascii="Arial" w:hAnsi="Arial" w:cs="Arial"/>
-        </w:rPr>
-        <w:t>cognomeRichiedenteStr: {#cognomeRichiedenteStr#}</w:t>
-      </w:r>
-    </w:p>
-    <w:p>
-      <w:pPr>
-        <w:rPr>
-          <w:rFonts w:ascii="Arial" w:hAnsi="Arial" w:cs="Arial"/>
-        </w:rPr>
-      </w:pPr>
-      <w:r>
-        <w:rPr>
-          <w:rFonts w:ascii="Arial" w:hAnsi="Arial" w:cs="Arial"/>
-        </w:rPr>
-        <w:t>nomeRichiedenteStr: {#nomeRichiedenteStr#}</w:t>
-      </w:r>
-    </w:p>
-    <w:p>
-      <w:pPr>
-        <w:rPr>
-          <w:rFonts w:ascii="Arial" w:hAnsi="Arial" w:cs="Arial"/>
-        </w:rPr>
-      </w:pPr>
+      <w:proofErr w:type="spellStart"/>
+      <w:r>
+        <w:rPr>
+          <w:rFonts w:ascii="Arial" w:hAnsi="Arial" w:cs="Arial"/>
+        </w:rPr>
+        <w:t>dataInizioValiditaStr</w:t>
+      </w:r>
+      <w:proofErr w:type="spellEnd"/>
+      <w:r>
+        <w:rPr>
+          <w:rFonts w:ascii="Arial" w:hAnsi="Arial" w:cs="Arial"/>
+        </w:rPr>
+        <w:t>: {#dataInizioValiditaStr#}</w:t>
+      </w:r>
+    </w:p>
+    <w:p>
+      <w:pPr>
+        <w:rPr>
+          <w:rFonts w:ascii="Arial" w:hAnsi="Arial" w:cs="Arial"/>
+        </w:rPr>
+      </w:pPr>
+      <w:proofErr w:type="spellStart"/>
+      <w:r>
+        <w:rPr>
+          <w:rFonts w:ascii="Arial" w:hAnsi="Arial" w:cs="Arial"/>
+        </w:rPr>
+        <w:t>dataFineValiditaStr</w:t>
+      </w:r>
+      <w:proofErr w:type="spellEnd"/>
+      <w:r>
+        <w:rPr>
+          <w:rFonts w:ascii="Arial" w:hAnsi="Arial" w:cs="Arial"/>
+        </w:rPr>
+        <w:t>: {#dataFineValiditaStr#}</w:t>
+      </w:r>
+    </w:p>
+    <w:p>
+      <w:pPr>
+        <w:rPr>
+          <w:rFonts w:ascii="Arial" w:hAnsi="Arial" w:cs="Arial"/>
+        </w:rPr>
+      </w:pPr>
+      <w:proofErr w:type="spellStart"/>
+      <w:r>
+        <w:rPr>
+          <w:rFonts w:ascii="Arial" w:hAnsi="Arial" w:cs="Arial"/>
+        </w:rPr>
+        <w:t>cognomeIstruttoreStr</w:t>
+      </w:r>
+      <w:proofErr w:type="spellEnd"/>
+      <w:r>
+        <w:rPr>
+          <w:rFonts w:ascii="Arial" w:hAnsi="Arial" w:cs="Arial"/>
+        </w:rPr>
+        <w:t>: {#cognomeIstruttoreStr#}</w:t>
+      </w:r>
+    </w:p>
+    <w:p>
+      <w:pPr>
+        <w:rPr>
+          <w:rFonts w:ascii="Arial" w:hAnsi="Arial" w:cs="Arial"/>
+        </w:rPr>
+      </w:pPr>
+      <w:proofErr w:type="spellStart"/>
+      <w:r>
+        <w:rPr>
+          <w:rFonts w:ascii="Arial" w:hAnsi="Arial" w:cs="Arial"/>
+        </w:rPr>
+        <w:t>nomeIstruttoreStr</w:t>
+      </w:r>
+      <w:proofErr w:type="spellEnd"/>
+      <w:r>
+        <w:rPr>
+          <w:rFonts w:ascii="Arial" w:hAnsi="Arial" w:cs="Arial"/>
+        </w:rPr>
+        <w:t>: {#nomeIstruttoreStr#}</w:t>
+      </w:r>
+    </w:p>
+    <w:p>
+      <w:pPr>
+        <w:rPr>
+          <w:rFonts w:ascii="Arial" w:hAnsi="Arial" w:cs="Arial"/>
+        </w:rPr>
+      </w:pPr>
+      <w:proofErr w:type="spellStart"/>
+      <w:r>
+        <w:rPr>
+          <w:rFonts w:ascii="Arial" w:hAnsi="Arial" w:cs="Arial"/>
+        </w:rPr>
+        <w:t>codiceFiscalePersonaGiuridica</w:t>
+      </w:r>
+      <w:proofErr w:type="spellEnd"/>
+      <w:r>
+        <w:rPr>
+          <w:rFonts w:ascii="Arial" w:hAnsi="Arial" w:cs="Arial"/>
+        </w:rPr>
+        <w:t xml:space="preserve">: </w:t>
+      </w:r>
+      <w:r>
+        <w:rPr>
+          <w:rFonts w:ascii="Arial" w:hAnsi="Arial" w:cs="Arial"/>
+        </w:rPr>
+        <w:t>{#</w:t>
+      </w:r>
+      <w:r>
+        <w:rPr>
+          <w:rFonts w:ascii="Arial" w:hAnsi="Arial" w:cs="Arial"/>
+        </w:rPr>
+        <w:t>codiceFiscalePersonaGiuridica</w:t>
+      </w:r>
+      <w:r>
+        <w:rPr>
+          <w:rFonts w:ascii="Arial" w:hAnsi="Arial" w:cs="Arial"/>
+        </w:rPr>
+        <w:t>#}</w:t>
+      </w:r>
+    </w:p>
+    <w:p>
+      <w:pPr>
+        <w:rPr>
+          <w:rFonts w:ascii="Arial" w:hAnsi="Arial" w:cs="Arial"/>
+        </w:rPr>
+      </w:pPr>
+      <w:proofErr w:type="spellStart"/>
+      <w:r>
+        <w:rPr>
+          <w:rFonts w:ascii="Arial" w:hAnsi="Arial" w:cs="Arial"/>
+        </w:rPr>
+        <w:t>ragioneSociale</w:t>
+      </w:r>
+      <w:proofErr w:type="spellEnd"/>
+      <w:r>
+        <w:rPr>
+          <w:rFonts w:ascii="Arial" w:hAnsi="Arial" w:cs="Arial"/>
+        </w:rPr>
+        <w:t xml:space="preserve">: </w:t>
+      </w:r>
+      <w:r>
+        <w:rPr>
+          <w:rFonts w:ascii="Arial" w:hAnsi="Arial" w:cs="Arial"/>
+        </w:rPr>
+        <w:t>{#</w:t>
+      </w:r>
+      <w:r>
+        <w:rPr>
+          <w:rFonts w:ascii="Arial" w:hAnsi="Arial" w:cs="Arial"/>
+        </w:rPr>
+        <w:t>ragioneSociale</w:t>
+      </w:r>
+      <w:r>
+        <w:rPr>
+          <w:rFonts w:ascii="Arial" w:hAnsi="Arial" w:cs="Arial"/>
+        </w:rPr>
+        <w:t>#}</w:t>
+      </w:r>
+    </w:p>
+    <w:p>
+      <w:pPr>
+        <w:rPr>
+          <w:rFonts w:ascii="Arial" w:hAnsi="Arial" w:cs="Arial"/>
+        </w:rPr>
+      </w:pPr>
+      <w:proofErr w:type="spellStart"/>
+      <w:r>
+        <w:rPr>
+          <w:rFonts w:ascii="Arial" w:hAnsi="Arial" w:cs="Arial"/>
+        </w:rPr>
+        <w:t>cognomeRichiedenteStr</w:t>
+      </w:r>
+      <w:proofErr w:type="spellEnd"/>
+      <w:r>
+        <w:rPr>
+          <w:rFonts w:ascii="Arial" w:hAnsi="Arial" w:cs="Arial"/>
+        </w:rPr>
+        <w:t>: {#cognomeRichiedenteStr#}</w:t>
+      </w:r>
+    </w:p>
+    <w:p>
+      <w:pPr>
+        <w:rPr>
+          <w:rFonts w:ascii="Arial" w:hAnsi="Arial" w:cs="Arial"/>
+        </w:rPr>
+      </w:pPr>
+      <w:proofErr w:type="spellStart"/>
+      <w:r>
+        <w:rPr>
+          <w:rFonts w:ascii="Arial" w:hAnsi="Arial" w:cs="Arial"/>
+        </w:rPr>
+        <w:t>nomeRichiedenteStr</w:t>
+      </w:r>
+      <w:proofErr w:type="spellEnd"/>
+      <w:r>
+        <w:rPr>
+          <w:rFonts w:ascii="Arial" w:hAnsi="Arial" w:cs="Arial"/>
+        </w:rPr>
+        <w:t>: {#nomeRichiedenteStr#}</w:t>
+      </w:r>
+    </w:p>
+    <w:p>
+      <w:pPr>
+        <w:rPr>
+          <w:rFonts w:ascii="Arial" w:hAnsi="Arial" w:cs="Arial"/>
+        </w:rPr>
+      </w:pPr>
+      <w:proofErr w:type="spellStart"/>
       <w:r>
         <w:rPr>
           <w:rFonts w:ascii="Arial" w:hAnsi="Arial" w:cs="Arial"/>
         </w:rPr>
         <w:t>comuneNascitaRichiedenteStr</w:t>
       </w:r>
+      <w:proofErr w:type="spellEnd"/>
       <w:r>
         <w:rPr>
           <w:rFonts w:ascii="Arial" w:hAnsi="Arial" w:cs="Arial"/>
@@ -231,12 +395,14 @@
           <w:rFonts w:ascii="Arial" w:hAnsi="Arial" w:cs="Arial"/>
         </w:rPr>
       </w:pPr>
+      <w:proofErr w:type="spellStart"/>
       <w:r>
         <w:rPr>
           <w:rFonts w:ascii="Arial" w:hAnsi="Arial" w:cs="Arial"/>
         </w:rPr>
         <w:t>dataNascitaRichiedenteStr</w:t>
       </w:r>
+      <w:proofErr w:type="spellEnd"/>
       <w:r>
         <w:rPr>
           <w:rFonts w:ascii="Arial" w:hAnsi="Arial" w:cs="Arial"/>
@@ -262,45 +428,70 @@
           <w:rFonts w:ascii="Arial" w:hAnsi="Arial" w:cs="Arial"/>
         </w:rPr>
       </w:pPr>
-      <w:r>
-        <w:rPr>
-          <w:rFonts w:ascii="Arial" w:hAnsi="Arial" w:cs="Arial"/>
-        </w:rPr>
-        <w:t>codiceFiscaleRichiedenteStr: {#codiceFiscaleRichiedenteStr#}</w:t>
-      </w:r>
-    </w:p>
-    <w:p>
-      <w:pPr>
-        <w:rPr>
-          <w:rFonts w:ascii="Arial" w:hAnsi="Arial" w:cs="Arial"/>
-        </w:rPr>
-      </w:pPr>
-      <w:r>
-        <w:rPr>
-          <w:rFonts w:ascii="Arial" w:hAnsi="Arial" w:cs="Arial"/>
-        </w:rPr>
-        <w:t>comuneResidenzaRichiedenteStr: {#comuneResidenzaRichiedenteStr#}</w:t>
-      </w:r>
-    </w:p>
-    <w:p>
-      <w:pPr>
-        <w:rPr>
-          <w:rFonts w:ascii="Arial" w:hAnsi="Arial" w:cs="Arial"/>
-        </w:rPr>
-      </w:pPr>
-      <w:r>
-        <w:rPr>
-          <w:rFonts w:ascii="Arial" w:hAnsi="Arial" w:cs="Arial"/>
-        </w:rPr>
-        <w:t>indirizzoResidenzaRichiedenteStr: {#indirizzoResidenzaRichiedenteStr#}</w:t>
-      </w:r>
-    </w:p>
-    <w:p>
-      <w:pPr>
-        <w:rPr>
-          <w:rFonts w:ascii="Arial" w:hAnsi="Arial" w:cs="Arial"/>
-        </w:rPr>
-      </w:pPr>
+      <w:proofErr w:type="spellStart"/>
+      <w:r>
+        <w:rPr>
+          <w:rFonts w:ascii="Arial" w:hAnsi="Arial" w:cs="Arial"/>
+        </w:rPr>
+        <w:t>codiceFiscaleRichiedenteStr</w:t>
+      </w:r>
+      <w:proofErr w:type="spellEnd"/>
+      <w:r>
+        <w:rPr>
+          <w:rFonts w:ascii="Arial" w:hAnsi="Arial" w:cs="Arial"/>
+        </w:rPr>
+        <w:t>: {#codiceFiscaleRichiedenteStr#}</w:t>
+      </w:r>
+    </w:p>
+    <w:p>
+      <w:pPr>
+        <w:rPr>
+          <w:rFonts w:ascii="Arial" w:hAnsi="Arial" w:cs="Arial"/>
+        </w:rPr>
+      </w:pPr>
+      <w:proofErr w:type="spellStart"/>
+      <w:r>
+        <w:rPr>
+          <w:rFonts w:ascii="Arial" w:hAnsi="Arial" w:cs="Arial"/>
+        </w:rPr>
+        <w:t>comuneResidenzaRichiedenteStr</w:t>
+      </w:r>
+      <w:proofErr w:type="spellEnd"/>
+      <w:r>
+        <w:rPr>
+          <w:rFonts w:ascii="Arial" w:hAnsi="Arial" w:cs="Arial"/>
+        </w:rPr>
+        <w:t>: {#comuneResidenzaRichiedenteStr#}</w:t>
+      </w:r>
+    </w:p>
+    <w:p>
+      <w:pPr>
+        <w:rPr>
+          <w:rFonts w:ascii="Arial" w:hAnsi="Arial" w:cs="Arial"/>
+        </w:rPr>
+      </w:pPr>
+      <w:proofErr w:type="spellStart"/>
+      <w:r>
+        <w:rPr>
+          <w:rFonts w:ascii="Arial" w:hAnsi="Arial" w:cs="Arial"/>
+        </w:rPr>
+        <w:t>indirizzoResidenzaRichiedenteStr</w:t>
+      </w:r>
+      <w:proofErr w:type="spellEnd"/>
+      <w:r>
+        <w:rPr>
+          <w:rFonts w:ascii="Arial" w:hAnsi="Arial" w:cs="Arial"/>
+        </w:rPr>
+        <w:t>: {#indirizzoResidenzaRichiedenteStr#}</w:t>
+      </w:r>
+    </w:p>
+    <w:p>
+      <w:pPr>
+        <w:rPr>
+          <w:rFonts w:ascii="Arial" w:hAnsi="Arial" w:cs="Arial"/>
+        </w:rPr>
+      </w:pPr>
+      <w:proofErr w:type="spellStart"/>
       <w:r>
         <w:rPr>
           <w:rFonts w:ascii="Arial" w:hAnsi="Arial" w:cs="Arial"/>
@@ -317,7 +508,14 @@
         <w:rPr>
           <w:rFonts w:ascii="Arial" w:hAnsi="Arial" w:cs="Arial"/>
         </w:rPr>
-        <w:t>rizzoAbitazioneDesignataStr: {#ind</w:t>
+        <w:t>rizzoAbitazioneDesignataStr</w:t>
+      </w:r>
+      <w:proofErr w:type="spellEnd"/>
+      <w:r>
+        <w:rPr>
+          <w:rFonts w:ascii="Arial" w:hAnsi="Arial" w:cs="Arial"/>
+        </w:rPr>
+        <w:t>: {#ind</w:t>
       </w:r>
       <w:r>
         <w:rPr>
@@ -338,64 +536,98 @@
           <w:rFonts w:ascii="Arial" w:hAnsi="Arial" w:cs="Arial"/>
         </w:rPr>
       </w:pPr>
-      <w:r>
-        <w:rPr>
-          <w:rFonts w:ascii="Arial" w:hAnsi="Arial" w:cs="Arial"/>
-        </w:rPr>
-        <w:t>catastoFoglioAbitazioneDesignataStr: {#catastoFoglioAbitazioneDesignataStr#}</w:t>
-      </w:r>
-    </w:p>
-    <w:p>
-      <w:pPr>
-        <w:rPr>
-          <w:rFonts w:ascii="Arial" w:hAnsi="Arial" w:cs="Arial"/>
-        </w:rPr>
-      </w:pPr>
-      <w:r>
-        <w:rPr>
-          <w:rFonts w:ascii="Arial" w:hAnsi="Arial" w:cs="Arial"/>
-        </w:rPr>
-        <w:t>catastoMappaleAbitazioneDesignataStr: {#catastoMappaleAbitazioneDesignataStr#}</w:t>
-      </w:r>
-    </w:p>
-    <w:p>
-      <w:pPr>
-        <w:rPr>
-          <w:rFonts w:ascii="Arial" w:hAnsi="Arial" w:cs="Arial"/>
-        </w:rPr>
-      </w:pPr>
-      <w:r>
-        <w:rPr>
-          <w:rFonts w:ascii="Arial" w:hAnsi="Arial" w:cs="Arial"/>
-        </w:rPr>
-        <w:t>catastoSubalternoAbitazioneDesignataStr: {#catastoSubalternoAbitazioneDesignataStr#}</w:t>
-      </w:r>
-    </w:p>
-    <w:p>
-      <w:pPr>
-        <w:rPr>
-          <w:rFonts w:ascii="Arial" w:hAnsi="Arial" w:cs="Arial"/>
-        </w:rPr>
-      </w:pPr>
-      <w:r>
-        <w:rPr>
-          <w:rFonts w:ascii="Arial" w:hAnsi="Arial" w:cs="Arial"/>
-        </w:rPr>
-        <w:t>catastoCategoriaAbitazioneDesignataStr: {#catastoCategoriaAbitazioneDesignataStr#}</w:t>
-      </w:r>
-    </w:p>
-    <w:p>
-      <w:pPr>
-        <w:rPr>
-          <w:rFonts w:ascii="Arial" w:hAnsi="Arial" w:cs="Arial"/>
-        </w:rPr>
-      </w:pPr>
+      <w:proofErr w:type="spellStart"/>
+      <w:r>
+        <w:rPr>
+          <w:rFonts w:ascii="Arial" w:hAnsi="Arial" w:cs="Arial"/>
+        </w:rPr>
+        <w:t>catastoFoglioAbitazioneDesignataStr</w:t>
+      </w:r>
+      <w:proofErr w:type="spellEnd"/>
+      <w:r>
+        <w:rPr>
+          <w:rFonts w:ascii="Arial" w:hAnsi="Arial" w:cs="Arial"/>
+        </w:rPr>
+        <w:t>: {#catastoFoglioAbitazioneDesignataStr#}</w:t>
+      </w:r>
+    </w:p>
+    <w:p>
+      <w:pPr>
+        <w:rPr>
+          <w:rFonts w:ascii="Arial" w:hAnsi="Arial" w:cs="Arial"/>
+        </w:rPr>
+      </w:pPr>
+      <w:proofErr w:type="spellStart"/>
+      <w:r>
+        <w:rPr>
+          <w:rFonts w:ascii="Arial" w:hAnsi="Arial" w:cs="Arial"/>
+        </w:rPr>
+        <w:t>catastoMappaleAbitazioneDesignataStr</w:t>
+      </w:r>
+      <w:proofErr w:type="spellEnd"/>
+      <w:r>
+        <w:rPr>
+          <w:rFonts w:ascii="Arial" w:hAnsi="Arial" w:cs="Arial"/>
+        </w:rPr>
+        <w:t>: {#catastoMappaleAbitazioneDesignataStr#}</w:t>
+      </w:r>
+    </w:p>
+    <w:p>
+      <w:pPr>
+        <w:rPr>
+          <w:rFonts w:ascii="Arial" w:hAnsi="Arial" w:cs="Arial"/>
+        </w:rPr>
+      </w:pPr>
+      <w:proofErr w:type="spellStart"/>
+      <w:r>
+        <w:rPr>
+          <w:rFonts w:ascii="Arial" w:hAnsi="Arial" w:cs="Arial"/>
+        </w:rPr>
+        <w:t>catastoSubalternoAbitazioneDesignataStr</w:t>
+      </w:r>
+      <w:proofErr w:type="spellEnd"/>
+      <w:r>
+        <w:rPr>
+          <w:rFonts w:ascii="Arial" w:hAnsi="Arial" w:cs="Arial"/>
+        </w:rPr>
+        <w:t>: {#catastoSubalternoAbitazioneDesignataStr#}</w:t>
+      </w:r>
+    </w:p>
+    <w:p>
+      <w:pPr>
+        <w:rPr>
+          <w:rFonts w:ascii="Arial" w:hAnsi="Arial" w:cs="Arial"/>
+        </w:rPr>
+      </w:pPr>
+      <w:proofErr w:type="spellStart"/>
+      <w:r>
+        <w:rPr>
+          <w:rFonts w:ascii="Arial" w:hAnsi="Arial" w:cs="Arial"/>
+        </w:rPr>
+        <w:t>catastoCategoriaAbitazioneDesignataStr</w:t>
+      </w:r>
+      <w:proofErr w:type="spellEnd"/>
+      <w:r>
+        <w:rPr>
+          <w:rFonts w:ascii="Arial" w:hAnsi="Arial" w:cs="Arial"/>
+        </w:rPr>
+        <w:t>: {#catastoCategoriaAbitazioneDesignataStr#}</w:t>
+      </w:r>
+    </w:p>
+    <w:p>
+      <w:pPr>
+        <w:rPr>
+          <w:rFonts w:ascii="Arial" w:hAnsi="Arial" w:cs="Arial"/>
+        </w:rPr>
+      </w:pPr>
+      <w:proofErr w:type="spellStart"/>
       <w:r>
         <w:rPr>
           <w:rFonts w:ascii="Arial" w:hAnsi="Arial" w:cs="Arial"/>
         </w:rPr>
         <w:t>veicoliSimultanei</w:t>
       </w:r>
+      <w:proofErr w:type="spellEnd"/>
       <w:r>
         <w:rPr>
           <w:rFonts w:ascii="Arial" w:hAnsi="Arial" w:cs="Arial"/>
@@ -421,12 +653,14 @@
           <w:rFonts w:ascii="Arial" w:hAnsi="Arial" w:cs="Arial"/>
         </w:rPr>
       </w:pPr>
+      <w:proofErr w:type="spellStart"/>
       <w:r>
         <w:rPr>
           <w:rFonts w:ascii="Arial" w:hAnsi="Arial" w:cs="Arial"/>
         </w:rPr>
         <w:t>verificationUrl</w:t>
       </w:r>
+      <w:proofErr w:type="spellEnd"/>
       <w:r>
         <w:rPr>
           <w:rFonts w:ascii="Arial" w:hAnsi="Arial" w:cs="Arial"/>
@@ -452,24 +686,48 @@
           <w:rFonts w:ascii="Arial" w:hAnsi="Arial" w:cs="Arial"/>
         </w:rPr>
       </w:pPr>
-      <w:r>
-        <w:rPr>
-          <w:rFonts w:ascii="Arial" w:hAnsi="Arial" w:cs="Arial"/>
-        </w:rPr>
-        <w:t xml:space="preserve">verificationUrlLink: </w:t>
-      </w:r>
-      <w:r>
-        <w:rPr>
-          <w:rFonts w:ascii="Arial" w:hAnsi="Arial" w:cs="Arial"/>
-        </w:rPr>
-        <w:t xml:space="preserve">{#LINK ({url: verificationUrl, label: </w:t>
-      </w:r>
+      <w:proofErr w:type="spellStart"/>
+      <w:r>
+        <w:rPr>
+          <w:rFonts w:ascii="Arial" w:hAnsi="Arial" w:cs="Arial"/>
+        </w:rPr>
+        <w:t>verificationUrlLink</w:t>
+      </w:r>
+      <w:proofErr w:type="spellEnd"/>
+      <w:r>
+        <w:rPr>
+          <w:rFonts w:ascii="Arial" w:hAnsi="Arial" w:cs="Arial"/>
+        </w:rPr>
+        <w:t xml:space="preserve">: </w:t>
+      </w:r>
+      <w:r>
+        <w:rPr>
+          <w:rFonts w:ascii="Arial" w:hAnsi="Arial" w:cs="Arial"/>
+        </w:rPr>
+        <w:t xml:space="preserve">{#LINK ({url: </w:t>
+      </w:r>
+      <w:proofErr w:type="spellStart"/>
       <w:r>
         <w:rPr>
           <w:rFonts w:ascii="Arial" w:hAnsi="Arial" w:cs="Arial"/>
         </w:rPr>
         <w:t>verificationUrl</w:t>
       </w:r>
+      <w:proofErr w:type="spellEnd"/>
+      <w:r>
+        <w:rPr>
+          <w:rFonts w:ascii="Arial" w:hAnsi="Arial" w:cs="Arial"/>
+        </w:rPr>
+        <w:t xml:space="preserve">, label: </w:t>
+      </w:r>
+      <w:proofErr w:type="spellStart"/>
+      <w:r>
+        <w:rPr>
+          <w:rFonts w:ascii="Arial" w:hAnsi="Arial" w:cs="Arial"/>
+        </w:rPr>
+        <w:t>verificationUrl</w:t>
+      </w:r>
+      <w:proofErr w:type="spellEnd"/>
       <w:r>
         <w:rPr>
           <w:rFonts w:ascii="Arial" w:hAnsi="Arial" w:cs="Arial"/>
@@ -493,7 +751,35 @@
         <w:rPr>
           <w:rFonts w:ascii="Arial" w:hAnsi="Arial" w:cs="Arial"/>
         </w:rPr>
-        <w:t>Targhe autorizzate: {#FOR targaObj IN targheArr#}</w:t>
+        <w:t xml:space="preserve">Targhe autorizzate: {#FOR </w:t>
+      </w:r>
+      <w:proofErr w:type="spellStart"/>
+      <w:r>
+        <w:rPr>
+          <w:rFonts w:ascii="Arial" w:hAnsi="Arial" w:cs="Arial"/>
+        </w:rPr>
+        <w:t>targaObj</w:t>
+      </w:r>
+      <w:proofErr w:type="spellEnd"/>
+      <w:r>
+        <w:rPr>
+          <w:rFonts w:ascii="Arial" w:hAnsi="Arial" w:cs="Arial"/>
+        </w:rPr>
+        <w:t xml:space="preserve"> IN </w:t>
+      </w:r>
+      <w:proofErr w:type="spellStart"/>
+      <w:r>
+        <w:rPr>
+          <w:rFonts w:ascii="Arial" w:hAnsi="Arial" w:cs="Arial"/>
+        </w:rPr>
+        <w:t>targheArr</w:t>
+      </w:r>
+      <w:proofErr w:type="spellEnd"/>
+      <w:r>
+        <w:rPr>
+          <w:rFonts w:ascii="Arial" w:hAnsi="Arial" w:cs="Arial"/>
+        </w:rPr>
+        <w:t>#}</w:t>
       </w:r>
       <w:r>
         <w:rPr>
@@ -505,7 +791,21 @@
         <w:rPr>
           <w:rFonts w:ascii="Arial" w:hAnsi="Arial" w:cs="Arial"/>
         </w:rPr>
-        <w:t>{#$idx + 1#}): {#INS $targaObj.targaStr#}</w:t>
+        <w:t>{#$idx + 1#}): {#INS $</w:t>
+      </w:r>
+      <w:proofErr w:type="spellStart"/>
+      <w:r>
+        <w:rPr>
+          <w:rFonts w:ascii="Arial" w:hAnsi="Arial" w:cs="Arial"/>
+        </w:rPr>
+        <w:t>targaObj.targaStr</w:t>
+      </w:r>
+      <w:proofErr w:type="spellEnd"/>
+      <w:r>
+        <w:rPr>
+          <w:rFonts w:ascii="Arial" w:hAnsi="Arial" w:cs="Arial"/>
+        </w:rPr>
+        <w:t>#}</w:t>
       </w:r>
       <w:r>
         <w:rPr>
@@ -517,7 +817,21 @@
         <w:rPr>
           <w:rFonts w:ascii="Arial" w:hAnsi="Arial" w:cs="Arial"/>
         </w:rPr>
-        <w:t>{#END-FOR targaObj#}</w:t>
+        <w:t xml:space="preserve">{#END-FOR </w:t>
+      </w:r>
+      <w:proofErr w:type="spellStart"/>
+      <w:r>
+        <w:rPr>
+          <w:rFonts w:ascii="Arial" w:hAnsi="Arial" w:cs="Arial"/>
+        </w:rPr>
+        <w:t>targaObj</w:t>
+      </w:r>
+      <w:proofErr w:type="spellEnd"/>
+      <w:r>
+        <w:rPr>
+          <w:rFonts w:ascii="Arial" w:hAnsi="Arial" w:cs="Arial"/>
+        </w:rPr>
+        <w:t>#}</w:t>
       </w:r>
     </w:p>
     <w:p>

</xml_diff>